<commit_message>
fix(carta): resolver references ?? -- substituir \ef{sec:pressure} por 3.5
A carta compilava independentemente do manuscrito, pelo que
\ef{sec:pressure} nao era resolvido e aparecia como ?? no PDF.

sec:pressure = §3.5 (Effective training pressure) -- confirmado no .aux
do manuscrito compilado.

Duas ocorrencias substituidas (linha 519-520 da carta):
  (Section~\ef{sec:pressure} in the revised manuscript)
  Section~\ef{sec:pressure} is an exploratory post-training...

PDF e DOCX da carta recompilados + pacote enviar/ actualizado.
Verificado: 0 linhas com ?? no PDF extraido; 17 ocorrencias de '3.5'."
</commit_message>
<xml_diff>
--- a/v4/docs/overleaf/response-to-reviewers.docx
+++ b/v4/docs/overleaf/response-to-reviewers.docx
@@ -2896,13 +2896,7 @@
         <w:t xml:space="preserve"> </w:t>
       </w:r>
       <w:r>
-        <w:t xml:space="preserve">(Section </w:t>
-      </w:r>
-      <w:r>
-        <w:t xml:space="preserve"> </w:t>
-      </w:r>
-      <w:r>
-        <w:t xml:space="preserve">in the revised manuscript):</w:t>
+        <w:t xml:space="preserve">(Section 3.5 in the revised manuscript):</w:t>
       </w:r>
       <w:r>
         <w:t xml:space="preserve"> </w:t>
@@ -2925,7 +2919,7 @@
         <w:t xml:space="preserve"> </w:t>
       </w:r>
       <w:r>
-        <w:t xml:space="preserve">introduced in Section </w:t>
+        <w:t xml:space="preserve">introduced in Section 3.5</w:t>
       </w:r>
       <w:r>
         <w:t xml:space="preserve"> </w:t>

</xml_diff>

<commit_message>
chore(submission): actualizar enviar/ com todas as correcções da sessão 3
Commit HEAD: 67315f4
manuscript-anonymous.docx  1,627 KB  02:21
manuscript-anonymous.pdf   2,112 KB  02:20
response-to-reviewers.docx   465 KB  02:21
response-to-reviewers.pdf  1,001 KB  02:20

Correcções incluídas:
  🔴1+2: p.13 carta — B7 p-valores e slope via macros
  🔴3: p.21 carta — Document format (ED-2) vs Font pipeline
  🔴4: fig9 — p-valores G2 corrigidos + dose 25% adicionada
  🟠6: R2-4.a — IC 3 doses G2"
</commit_message>
<xml_diff>
--- a/v4/docs/overleaf/response-to-reviewers.docx
+++ b/v4/docs/overleaf/response-to-reviewers.docx
@@ -5025,6 +5025,122 @@
       <w:r>
         <w:t xml:space="preserve"> pp at 10% removal (</w:t>
       </w:r>
+      <w:r>
+        <w:t xml:space="preserve">$p=\BsevenPtenTen$</w:t>
+      </w:r>
+      <w:r>
+        <w:t xml:space="preserve">, 95% CI</w:t>
+      </w:r>
+      <w:r>
+        <w:t xml:space="preserve"> </w:t>
+      </w:r>
+      <m:oMath>
+        <m:r>
+          <m:rPr>
+            <m:sty m:val="p"/>
+          </m:rPr>
+          <m:t>[</m:t>
+        </m:r>
+        <m:r>
+          <m:rPr>
+            <m:sty m:val="p"/>
+          </m:rPr>
+          <m:t>−</m:t>
+        </m:r>
+        <m:r>
+          <m:t>1.1</m:t>
+        </m:r>
+        <m:r>
+          <m:rPr>
+            <m:sty m:val="p"/>
+          </m:rPr>
+          <m:t>,</m:t>
+        </m:r>
+        <m:r>
+          <m:t>4.7</m:t>
+        </m:r>
+        <m:r>
+          <m:rPr>
+            <m:sty m:val="p"/>
+          </m:rPr>
+          <m:t>]</m:t>
+        </m:r>
+      </m:oMath>
+      <w:r>
+        <w:t xml:space="preserve">),</w:t>
+      </w:r>
+      <w:r>
+        <w:t xml:space="preserve"> </w:t>
+      </w:r>
+      <m:oMath>
+        <m:r>
+          <m:rPr>
+            <m:sty m:val="p"/>
+          </m:rPr>
+          <m:t>+</m:t>
+        </m:r>
+        <m:r>
+          <m:t>4.9</m:t>
+        </m:r>
+      </m:oMath>
+      <w:r>
+        <w:t xml:space="preserve"> pp at 25% (</w:t>
+      </w:r>
+      <w:r>
+        <w:t xml:space="preserve">$p=\BsevenPtenTfive$</w:t>
+      </w:r>
+      <w:r>
+        <w:t xml:space="preserve">, 95% CI</w:t>
+      </w:r>
+      <w:r>
+        <w:t xml:space="preserve"> </w:t>
+      </w:r>
+      <m:oMath>
+        <m:r>
+          <m:rPr>
+            <m:sty m:val="p"/>
+          </m:rPr>
+          <m:t>[</m:t>
+        </m:r>
+        <m:r>
+          <m:t>2.5</m:t>
+        </m:r>
+        <m:r>
+          <m:rPr>
+            <m:sty m:val="p"/>
+          </m:rPr>
+          <m:t>,</m:t>
+        </m:r>
+        <m:r>
+          <m:t>7.2</m:t>
+        </m:r>
+        <m:r>
+          <m:rPr>
+            <m:sty m:val="p"/>
+          </m:rPr>
+          <m:t>]</m:t>
+        </m:r>
+      </m:oMath>
+      <w:r>
+        <w:t xml:space="preserve">), and</w:t>
+      </w:r>
+      <w:r>
+        <w:t xml:space="preserve"> </w:t>
+      </w:r>
+      <m:oMath>
+        <m:r>
+          <m:rPr>
+            <m:sty m:val="p"/>
+          </m:rPr>
+          <m:t>+</m:t>
+        </m:r>
+        <m:r>
+          <m:t>9.2</m:t>
+        </m:r>
+      </m:oMath>
+      <w:r>
+        <w:t xml:space="preserve"> pp at 50% (</w:t>
+      </w:r>
       <m:oMath>
         <m:r>
           <m:t>p</m:t>
@@ -5033,10 +5149,10 @@
           <m:rPr>
             <m:sty m:val="p"/>
           </m:rPr>
-          <m:t>=</m:t>
-        </m:r>
-        <m:r>
-          <m:t>0.200</m:t>
+          <m:t>&lt;</m:t>
+        </m:r>
+        <m:r>
+          <m:t>0.001</m:t>
         </m:r>
       </m:oMath>
       <w:r>
@@ -5053,13 +5169,7 @@
           <m:t>[</m:t>
         </m:r>
         <m:r>
-          <m:rPr>
-            <m:sty m:val="p"/>
-          </m:rPr>
-          <m:t>−</m:t>
-        </m:r>
-        <m:r>
-          <m:t>1.1</m:t>
+          <m:t>6.9</m:t>
         </m:r>
         <m:r>
           <m:rPr>
@@ -5068,7 +5178,7 @@
           <m:t>,</m:t>
         </m:r>
         <m:r>
-          <m:t>4.7</m:t>
+          <m:t>11.6</m:t>
         </m:r>
         <m:r>
           <m:rPr>
@@ -5078,171 +5188,23 @@
         </m:r>
       </m:oMath>
       <w:r>
-        <w:t xml:space="preserve">),</w:t>
-      </w:r>
-      <w:r>
-        <w:t xml:space="preserve"> </w:t>
-      </w:r>
-      <m:oMath>
-        <m:r>
-          <m:rPr>
-            <m:sty m:val="p"/>
-          </m:rPr>
-          <m:t>+</m:t>
-        </m:r>
-        <m:r>
-          <m:t>4.9</m:t>
-        </m:r>
-      </m:oMath>
-      <w:r>
-        <w:t xml:space="preserve"> pp at 25% (</w:t>
-      </w:r>
-      <m:oMath>
-        <m:r>
-          <m:t>p</m:t>
-        </m:r>
-        <m:r>
-          <m:rPr>
-            <m:sty m:val="p"/>
-          </m:rPr>
-          <m:t>=</m:t>
-        </m:r>
-        <m:r>
-          <m:t>0.001</m:t>
-        </m:r>
-      </m:oMath>
-      <w:r>
-        <w:t xml:space="preserve">, 95% CI</w:t>
-      </w:r>
-      <w:r>
-        <w:t xml:space="preserve"> </w:t>
-      </w:r>
-      <m:oMath>
-        <m:r>
-          <m:rPr>
-            <m:sty m:val="p"/>
-          </m:rPr>
-          <m:t>[</m:t>
-        </m:r>
-        <m:r>
-          <m:t>2.5</m:t>
-        </m:r>
-        <m:r>
-          <m:rPr>
-            <m:sty m:val="p"/>
-          </m:rPr>
-          <m:t>,</m:t>
-        </m:r>
-        <m:r>
-          <m:t>7.2</m:t>
-        </m:r>
-        <m:r>
-          <m:rPr>
-            <m:sty m:val="p"/>
-          </m:rPr>
-          <m:t>]</m:t>
-        </m:r>
-      </m:oMath>
-      <w:r>
-        <w:t xml:space="preserve">), and</w:t>
-      </w:r>
-      <w:r>
-        <w:t xml:space="preserve"> </w:t>
-      </w:r>
-      <m:oMath>
-        <m:r>
-          <m:rPr>
-            <m:sty m:val="p"/>
-          </m:rPr>
-          <m:t>+</m:t>
-        </m:r>
-        <m:r>
-          <m:t>9.2</m:t>
-        </m:r>
-      </m:oMath>
-      <w:r>
-        <w:t xml:space="preserve"> pp at 50% (</w:t>
-      </w:r>
-      <m:oMath>
-        <m:r>
-          <m:t>p</m:t>
-        </m:r>
-        <m:r>
-          <m:rPr>
-            <m:sty m:val="p"/>
-          </m:rPr>
-          <m:t>&lt;</m:t>
-        </m:r>
-        <m:r>
-          <m:t>0.001</m:t>
-        </m:r>
-      </m:oMath>
-      <w:r>
-        <w:t xml:space="preserve">, 95% CI</w:t>
-      </w:r>
-      <w:r>
-        <w:t xml:space="preserve"> </w:t>
-      </w:r>
-      <m:oMath>
-        <m:r>
-          <m:rPr>
-            <m:sty m:val="p"/>
-          </m:rPr>
-          <m:t>[</m:t>
-        </m:r>
-        <m:r>
-          <m:t>6.9</m:t>
-        </m:r>
-        <m:r>
-          <m:rPr>
-            <m:sty m:val="p"/>
-          </m:rPr>
-          <m:t>,</m:t>
-        </m:r>
-        <m:r>
-          <m:t>11.6</m:t>
-        </m:r>
-        <m:r>
-          <m:rPr>
-            <m:sty m:val="p"/>
-          </m:rPr>
-          <m:t>]</m:t>
-        </m:r>
-      </m:oMath>
-      <w:r>
         <w:t xml:space="preserve">). At 50% removal, the Generation 5–10 retention slope was</w:t>
       </w:r>
       <w:r>
         <w:t xml:space="preserve"> </w:t>
       </w:r>
-      <m:oMath>
-        <m:r>
-          <m:rPr>
-            <m:sty m:val="p"/>
-          </m:rPr>
-          <m:t>−</m:t>
-        </m:r>
-        <m:r>
-          <m:t>0.14</m:t>
-        </m:r>
-      </m:oMath>
+      <w:r>
+        <w:t xml:space="preserve">$\BsevenSlopeFifty$</w:t>
+      </w:r>
       <w:r>
         <w:t xml:space="preserve"> pp/generation, compared with</w:t>
       </w:r>
       <w:r>
         <w:t xml:space="preserve"> </w:t>
       </w:r>
-      <m:oMath>
-        <m:r>
-          <m:rPr>
-            <m:sty m:val="p"/>
-          </m:rPr>
-          <m:t>−</m:t>
-        </m:r>
-        <m:r>
-          <m:t>1.13</m:t>
-        </m:r>
-      </m:oMath>
+      <w:r>
+        <w:t xml:space="preserve">$\BsevenSlopeZero$</w:t>
+      </w:r>
       <w:r>
         <w:t xml:space="preserve"> pp/generation without removal. The attenuation of the later decline is therefore supported for this Qwen configuration and protocol. The revised manuscript states:</w:t>
       </w:r>
@@ -5255,36 +5217,26 @@
       <w:r>
         <w:t xml:space="preserve"> </w:t>
       </w:r>
-      <m:oMath>
-        <m:r>
-          <m:rPr>
-            <m:sty m:val="p"/>
-          </m:rPr>
-          <m:t>−</m:t>
-        </m:r>
-        <m:r>
-          <m:t>0.14</m:t>
-        </m:r>
-      </m:oMath>
+      <w:r>
+        <w:t xml:space="preserve">$\BsevenSlopeFifty$</w:t>
+      </w:r>
       <w:r>
         <w:t xml:space="preserve"> pp/generation versus</w:t>
       </w:r>
       <w:r>
         <w:t xml:space="preserve"> </w:t>
       </w:r>
-      <m:oMath>
-        <m:r>
-          <m:rPr>
-            <m:sty m:val="p"/>
-          </m:rPr>
-          <m:t>−</m:t>
-        </m:r>
-        <m:r>
-          <m:t>1.13</m:t>
-        </m:r>
-      </m:oMath>
+      <w:r>
+        <w:t xml:space="preserve">$\BsevenSlopeZero$</w:t>
+      </w:r>
       <w:r>
         <w:t xml:space="preserve"> pp/generation at 0% (mean across five seeds).”</w:t>
+      </w:r>
+      <w:r>
+        <w:t xml:space="preserve"> </w:t>
+      </w:r>
+      <w:r>
+        <w:t xml:space="preserve">[verbatim]</w:t>
       </w:r>
       <w:r>
         <w:t xml:space="preserve"> </w:t>
@@ -6466,7 +6418,7 @@
           <m:t>=</m:t>
         </m:r>
         <m:r>
-          <m:t>0.200</m:t>
+          <m:t>0.160</m:t>
         </m:r>
       </m:oMath>
       <w:r>
@@ -6538,7 +6490,7 @@
           <m:t>=</m:t>
         </m:r>
         <m:r>
-          <m:t>0.001</m:t>
+          <m:t>0.0044</m:t>
         </m:r>
       </m:oMath>
       <w:r>
@@ -13722,19 +13674,25 @@
           <w:b/>
           <w:bCs/>
         </w:rPr>
-        <w:t xml:space="preserve">Font pipeline changed.</w:t>
-      </w:r>
-      <w:r>
-        <w:t xml:space="preserve"> </w:t>
-      </w:r>
-      <w:r>
-        <w:t xml:space="preserve">No embedded subset uses a non-standard encoding. The revised PDF</w:t>
-      </w:r>
-      <w:r>
-        <w:t xml:space="preserve"> </w:t>
-      </w:r>
-      <w:r>
-        <w:t xml:space="preserve">uses</w:t>
+        <w:t xml:space="preserve">Document format changed (ED-2).</w:t>
+      </w:r>
+      <w:r>
+        <w:t xml:space="preserve"> </w:t>
+      </w:r>
+      <w:r>
+        <w:t xml:space="preserve">Rather than attempt a further font-pipeline fix, the revised</w:t>
+      </w:r>
+      <w:r>
+        <w:t xml:space="preserve"> </w:t>
+      </w:r>
+      <w:r>
+        <w:t xml:space="preserve">manuscript is submitted as a Word document, in which equations are</w:t>
+      </w:r>
+      <w:r>
+        <w:t xml:space="preserve"> </w:t>
+      </w:r>
+      <w:r>
+        <w:t xml:space="preserve">OMML objects and no</w:t>
       </w:r>
       <w:r>
         <w:t xml:space="preserve"> </w:t>
@@ -13743,13 +13701,19 @@
         <w:rPr>
           <w:rStyle w:val="VerbatimChar"/>
         </w:rPr>
-        <w:t xml:space="preserve">cmap</w:t>
-      </w:r>
-      <w:r>
-        <w:t xml:space="preserve"> </w:t>
-      </w:r>
-      <w:r>
-        <w:t xml:space="preserve">and</w:t>
+        <w:t xml:space="preserve">ToUnicode</w:t>
+      </w:r>
+      <w:r>
+        <w:t xml:space="preserve"> </w:t>
+      </w:r>
+      <w:r>
+        <w:t xml:space="preserve">mapping is involved.</w:t>
+      </w:r>
+      <w:r>
+        <w:t xml:space="preserve"> </w:t>
+      </w:r>
+      <w:r>
+        <w:t xml:space="preserve">Verification: the</w:t>
       </w:r>
       <w:r>
         <w:t xml:space="preserve"> </w:t>
@@ -13758,43 +13722,64 @@
         <w:rPr>
           <w:rStyle w:val="VerbatimChar"/>
         </w:rPr>
-        <w:t xml:space="preserve">glyphtounicode</w:t>
-      </w:r>
-      <w:r>
-        <w:t xml:space="preserve"> </w:t>
-      </w:r>
-      <w:r>
-        <w:t xml:space="preserve">to maximize</w:t>
-      </w:r>
-      <w:r>
-        <w:t xml:space="preserve"> </w:t>
-      </w:r>
-      <w:r>
-        <w:t xml:space="preserve">Unicode coverage; a residual number of Latin Modern Math Type 1</w:t>
-      </w:r>
-      <w:r>
-        <w:t xml:space="preserve"> </w:t>
-      </w:r>
-      <w:r>
-        <w:t xml:space="preserve">operators lack ToUnicode entries (a known limitation of that font</w:t>
-      </w:r>
-      <w:r>
-        <w:t xml:space="preserve"> </w:t>
-      </w:r>
-      <w:r>
-        <w:t xml:space="preserve">subset) and are flagged in the audit output, which is included in</w:t>
-      </w:r>
-      <w:r>
-        <w:t xml:space="preserve"> </w:t>
-      </w:r>
-      <w:r>
-        <w:t xml:space="preserve">the replication package.</w:t>
-      </w:r>
-      <w:r>
-        <w:t xml:space="preserve"> </w:t>
-      </w:r>
-      <w:r>
-        <w:t xml:space="preserve">The fault was verified at the point where it appears, not only locally.</w:t>
+        <w:t xml:space="preserve">.docx</w:t>
+      </w:r>
+      <w:r>
+        <w:t xml:space="preserve"> </w:t>
+      </w:r>
+      <w:r>
+        <w:t xml:space="preserve">generated from the same LaTeX</w:t>
+      </w:r>
+      <w:r>
+        <w:t xml:space="preserve"> </w:t>
+      </w:r>
+      <w:r>
+        <w:t xml:space="preserve">source extracts with zero character substitutions and contains</w:t>
+      </w:r>
+      <w:r>
+        <w:t xml:space="preserve"> </w:t>
+      </w:r>
+      <w:r>
+        <w:t xml:space="preserve">611 equations in native OMML. The compiled PDF is provided as a</w:t>
+      </w:r>
+      <w:r>
+        <w:t xml:space="preserve"> </w:t>
+      </w:r>
+      <w:r>
+        <w:t xml:space="preserve">secondary file per ED-2; it still relies on Latin Modern Math</w:t>
+      </w:r>
+      <w:r>
+        <w:t xml:space="preserve"> </w:t>
+      </w:r>
+      <w:r>
+        <w:t xml:space="preserve">Type 1 subsets, and</w:t>
+      </w:r>
+      <w:r>
+        <w:t xml:space="preserve"> </w:t>
+      </w:r>
+      <w:r>
+        <w:rPr>
+          <w:rStyle w:val="VerbatimChar"/>
+        </w:rPr>
+        <w:t xml:space="preserve">scripts/audits/glyph_audit.py</w:t>
+      </w:r>
+      <w:r>
+        <w:t xml:space="preserve"> </w:t>
+      </w:r>
+      <w:r>
+        <w:t xml:space="preserve">reports the residual</w:t>
+      </w:r>
+      <w:r>
+        <w:t xml:space="preserve"> </w:t>
+      </w:r>
+      <w:r>
+        <w:t xml:space="preserve">substitutions in that file so the limitation is documented rather</w:t>
+      </w:r>
+      <w:r>
+        <w:t xml:space="preserve"> </w:t>
+      </w:r>
+      <w:r>
+        <w:t xml:space="preserve">than asserted to be absent.</w:t>
       </w:r>
     </w:p>
     <w:p>
@@ -18648,7 +18633,7 @@
               <w:jc w:val="left"/>
             </w:pPr>
             <w:r>
-              <w:t xml:space="preserve">94.4%</w:t>
+              <w:t xml:space="preserve">94.3%</w:t>
             </w:r>
           </w:p>
         </w:tc>
@@ -21060,13 +21045,13 @@
         <w:t xml:space="preserve"> </w:t>
       </w:r>
       <w:r>
-        <w:t xml:space="preserve">dose level, with 95 % confidence intervals for every Gen10 dose on</w:t>
-      </w:r>
-      <w:r>
-        <w:t xml:space="preserve"> </w:t>
-      </w:r>
-      <w:r>
-        <w:t xml:space="preserve">Qwen (B7) and for the 50% dose on Gemma 3 (G2). Where groups are not</w:t>
+        <w:t xml:space="preserve">dose level, with 95 % confidence intervals for every Gen10 dose in</w:t>
+      </w:r>
+      <w:r>
+        <w:t xml:space="preserve"> </w:t>
+      </w:r>
+      <w:r>
+        <w:t xml:space="preserve">both experiments (B7 and G2). Where groups are not</w:t>
       </w:r>
       <w:r>
         <w:t xml:space="preserve"> </w:t>

</xml_diff>

<commit_message>
fix(carta): 11 menores m1-m10 + MANIFEST + AUDIT_REPORT
m1  normalised -> normalized (L989)
m2  fifteen 'of overstatement' + three 'of a different category' (L906, L1453)
m3  supplementary.pdf mencionado na lista ED-2 (L350)
m4  PNG/TIFF -> PNG (L340, unifcado)
m5  'exact substrings' -> 'rarely appear verbatim' (L424, L652)
m6  'Excerpt: all 7 rows' -> 'All 7 rows shown' (L172)
m7  R2-1.10: 'n-gram order in superscript' -> 'digit in identifier' (L265)
m8  Aspas duplas em p.30: removidas aspas LaTeX dentro de newtext (L1687)
m9  'rules out shuffle-order artifact' -> 'tests data-order dependence (non-significant; neither variable isolated)' (L189)
m10 [verbatim] em 3 passagens: B7 slope (67315f4), optimizer state (L572), effective rank portability (L750)

14/14 PASS
enviar/ actualizado: response-to-reviewers.pdf+.docx"
</commit_message>
<xml_diff>
--- a/v4/docs/overleaf/response-to-reviewers.docx
+++ b/v4/docs/overleaf/response-to-reviewers.docx
@@ -989,7 +989,7 @@
         <w:br/>
       </w:r>
       <w:r>
-        <w:t xml:space="preserve">Excerpt: all 7 rows shown. Full table in the revised manuscript (Section 3.9).</w:t>
+        <w:t xml:space="preserve">All 7 rows shown; complete formatted table in the revised manuscript (Section 3.9).</w:t>
       </w:r>
     </w:p>
     <w:p>
@@ -1430,6 +1430,18 @@
       <w:r>
         <w:t xml:space="preserve">.</w:t>
       </w:r>
+      <w:r>
+        <w:t xml:space="preserve"> </w:t>
+      </w:r>
+      <w:r>
+        <w:t xml:space="preserve">The supplementary material (Table S1) is submitted as a separate</w:t>
+      </w:r>
+      <w:r>
+        <w:t xml:space="preserve"> </w:t>
+      </w:r>
+      <w:r>
+        <w:t xml:space="preserve">PDF file, as it contains only a reference table with SHA-1 hashes.</w:t>
+      </w:r>
     </w:p>
     <w:p>
       <w:pPr>
@@ -1449,7 +1461,7 @@
         <w:t xml:space="preserve"> </w:t>
       </w:r>
       <w:r>
-        <w:t xml:space="preserve">All figures re-exported at 300 dpi; PDF pipeline replaced.</w:t>
+        <w:t xml:space="preserve">All figures re-exported at 300 dpi in PNG; PDF pipeline replaced.</w:t>
       </w:r>
     </w:p>
     <w:p>
@@ -2051,7 +2063,7 @@
         <w:t xml:space="preserve"> </w:t>
       </w:r>
       <w:r>
-        <w:t xml:space="preserve">TriviaQA aliases rarely form exact substrings of the generated output. More</w:t>
+        <w:t xml:space="preserve">TriviaQA aliases rarely appear verbatim in the generated output. More</w:t>
       </w:r>
       <w:r>
         <w:t xml:space="preserve"> </w:t>
@@ -3499,6 +3511,12 @@
       <w:r>
         <w:t xml:space="preserve">“The trained update and optimizer state are not carried forward.”</w:t>
       </w:r>
+      <w:r>
+        <w:t xml:space="preserve"> </w:t>
+      </w:r>
+      <w:r>
+        <w:t xml:space="preserve">[verbatim]</w:t>
+      </w:r>
     </w:p>
     <w:p>
       <w:pPr>
@@ -4448,7 +4466,7 @@
         <w:t xml:space="preserve"> </w:t>
       </w:r>
       <w:r>
-        <w:t xml:space="preserve">(which are rarely exact substrings of generated responses), so the</w:t>
+        <w:t xml:space="preserve">(which rarely appear verbatim in generated responses), so the</w:t>
       </w:r>
       <w:r>
         <w:t xml:space="preserve"> </w:t>
@@ -5025,9 +5043,20 @@
       <w:r>
         <w:t xml:space="preserve"> pp at 10% removal (</w:t>
       </w:r>
-      <w:r>
-        <w:t xml:space="preserve">$p=\BsevenPtenTen$</w:t>
-      </w:r>
+      <m:oMath>
+        <m:r>
+          <m:t>p</m:t>
+        </m:r>
+        <m:r>
+          <m:rPr>
+            <m:sty m:val="p"/>
+          </m:rPr>
+          <m:t>=</m:t>
+        </m:r>
+        <m:r>
+          <m:t>0.160</m:t>
+        </m:r>
+      </m:oMath>
       <w:r>
         <w:t xml:space="preserve">, 95% CI</w:t>
       </w:r>
@@ -5086,9 +5115,20 @@
       <w:r>
         <w:t xml:space="preserve"> pp at 25% (</w:t>
       </w:r>
-      <w:r>
-        <w:t xml:space="preserve">$p=\BsevenPtenTfive$</w:t>
-      </w:r>
+      <m:oMath>
+        <m:r>
+          <m:t>p</m:t>
+        </m:r>
+        <m:r>
+          <m:rPr>
+            <m:sty m:val="p"/>
+          </m:rPr>
+          <m:t>=</m:t>
+        </m:r>
+        <m:r>
+          <m:t>0.0044</m:t>
+        </m:r>
+      </m:oMath>
       <w:r>
         <w:t xml:space="preserve">, 95% CI</w:t>
       </w:r>
@@ -5193,18 +5233,34 @@
       <w:r>
         <w:t xml:space="preserve"> </w:t>
       </w:r>
-      <w:r>
-        <w:t xml:space="preserve">$\BsevenSlopeFifty$</w:t>
-      </w:r>
+      <m:oMath>
+        <m:r>
+          <m:rPr>
+            <m:sty m:val="p"/>
+          </m:rPr>
+          <m:t>−</m:t>
+        </m:r>
+        <m:r>
+          <m:t>0.15</m:t>
+        </m:r>
+      </m:oMath>
       <w:r>
         <w:t xml:space="preserve"> pp/generation, compared with</w:t>
       </w:r>
       <w:r>
         <w:t xml:space="preserve"> </w:t>
       </w:r>
-      <w:r>
-        <w:t xml:space="preserve">$\BsevenSlopeZero$</w:t>
-      </w:r>
+      <m:oMath>
+        <m:r>
+          <m:rPr>
+            <m:sty m:val="p"/>
+          </m:rPr>
+          <m:t>−</m:t>
+        </m:r>
+        <m:r>
+          <m:t>1.13</m:t>
+        </m:r>
+      </m:oMath>
       <w:r>
         <w:t xml:space="preserve"> pp/generation without removal. The attenuation of the later decline is therefore supported for this Qwen configuration and protocol. The revised manuscript states:</w:t>
       </w:r>
@@ -5217,18 +5273,34 @@
       <w:r>
         <w:t xml:space="preserve"> </w:t>
       </w:r>
-      <w:r>
-        <w:t xml:space="preserve">$\BsevenSlopeFifty$</w:t>
-      </w:r>
+      <m:oMath>
+        <m:r>
+          <m:rPr>
+            <m:sty m:val="p"/>
+          </m:rPr>
+          <m:t>−</m:t>
+        </m:r>
+        <m:r>
+          <m:t>0.15</m:t>
+        </m:r>
+      </m:oMath>
       <w:r>
         <w:t xml:space="preserve"> pp/generation versus</w:t>
       </w:r>
       <w:r>
         <w:t xml:space="preserve"> </w:t>
       </w:r>
-      <w:r>
-        <w:t xml:space="preserve">$\BsevenSlopeZero$</w:t>
-      </w:r>
+      <m:oMath>
+        <m:r>
+          <m:rPr>
+            <m:sty m:val="p"/>
+          </m:rPr>
+          <m:t>−</m:t>
+        </m:r>
+        <m:r>
+          <m:t>1.13</m:t>
+        </m:r>
+      </m:oMath>
       <w:r>
         <w:t xml:space="preserve"> pp/generation at 0% (mean across five seeds).”</w:t>
       </w:r>
@@ -6099,102 +6171,252 @@
       <w:r>
         <w:t xml:space="preserve"> </w:t>
       </w:r>
-      <w:r>
-        <w:t xml:space="preserve">$\GtwoDeltatenFifty$</w:t>
-      </w:r>
+      <m:oMath>
+        <m:r>
+          <m:rPr>
+            <m:sty m:val="p"/>
+          </m:rPr>
+          <m:t>+</m:t>
+        </m:r>
+        <m:r>
+          <m:t>12.9</m:t>
+        </m:r>
+      </m:oMath>
       <w:r>
         <w:t xml:space="preserve"> pp across three paired seeds (95% CI</w:t>
       </w:r>
       <w:r>
         <w:t xml:space="preserve"> </w:t>
       </w:r>
-      <w:r>
-        <w:t xml:space="preserve">$[\GtwoCItenLoFifty, \GtwoCItenHiFifty]$</w:t>
-      </w:r>
+      <m:oMath>
+        <m:r>
+          <m:rPr>
+            <m:sty m:val="p"/>
+          </m:rPr>
+          <m:t>[</m:t>
+        </m:r>
+        <m:r>
+          <m:t>9.70</m:t>
+        </m:r>
+        <m:r>
+          <m:rPr>
+            <m:sty m:val="p"/>
+          </m:rPr>
+          <m:t>,</m:t>
+        </m:r>
+        <m:r>
+          <m:t>16.10</m:t>
+        </m:r>
+        <m:r>
+          <m:rPr>
+            <m:sty m:val="p"/>
+          </m:rPr>
+          <m:t>]</m:t>
+        </m:r>
+      </m:oMath>
       <w:r>
         <w:t xml:space="preserve">,</w:t>
       </w:r>
       <w:r>
         <w:t xml:space="preserve"> </w:t>
       </w:r>
-      <w:r>
-        <w:t xml:space="preserve">$p=\GtwoPtenFifty$</w:t>
-      </w:r>
+      <m:oMath>
+        <m:r>
+          <m:t>p</m:t>
+        </m:r>
+        <m:r>
+          <m:rPr>
+            <m:sty m:val="p"/>
+          </m:rPr>
+          <m:t>=</m:t>
+        </m:r>
+        <m:r>
+          <m:t>0.003</m:t>
+        </m:r>
+      </m:oMath>
       <w:r>
         <w:t xml:space="preserve">), with the 10% and 25% doses giving</w:t>
       </w:r>
       <w:r>
         <w:t xml:space="preserve"> </w:t>
       </w:r>
-      <w:r>
-        <w:t xml:space="preserve">$\GtwoDeltatenTen$</w:t>
-      </w:r>
+      <m:oMath>
+        <m:r>
+          <m:rPr>
+            <m:sty m:val="p"/>
+          </m:rPr>
+          <m:t>+</m:t>
+        </m:r>
+        <m:r>
+          <m:t>9.8</m:t>
+        </m:r>
+      </m:oMath>
       <w:r>
         <w:t xml:space="preserve"> pp (</w:t>
       </w:r>
-      <w:r>
-        <w:t xml:space="preserve">$p=\GtwoPtenTen$</w:t>
-      </w:r>
+      <m:oMath>
+        <m:r>
+          <m:t>p</m:t>
+        </m:r>
+        <m:r>
+          <m:rPr>
+            <m:sty m:val="p"/>
+          </m:rPr>
+          <m:t>=</m:t>
+        </m:r>
+        <m:r>
+          <m:t>0.006</m:t>
+        </m:r>
+      </m:oMath>
       <w:r>
         <w:t xml:space="preserve">, 95 % CI</w:t>
       </w:r>
       <w:r>
         <w:t xml:space="preserve"> </w:t>
       </w:r>
-      <w:r>
-        <w:t xml:space="preserve">$[\GtwoCItenLoTen, \GtwoCItenHiTen]$</w:t>
-      </w:r>
+      <m:oMath>
+        <m:r>
+          <m:rPr>
+            <m:sty m:val="p"/>
+          </m:rPr>
+          <m:t>[</m:t>
+        </m:r>
+        <m:r>
+          <m:t>6.70</m:t>
+        </m:r>
+        <m:r>
+          <m:rPr>
+            <m:sty m:val="p"/>
+          </m:rPr>
+          <m:t>,</m:t>
+        </m:r>
+        <m:r>
+          <m:t>13.00</m:t>
+        </m:r>
+        <m:r>
+          <m:rPr>
+            <m:sty m:val="p"/>
+          </m:rPr>
+          <m:t>]</m:t>
+        </m:r>
+      </m:oMath>
       <w:r>
         <w:t xml:space="preserve">) and</w:t>
       </w:r>
       <w:r>
         <w:t xml:space="preserve"> </w:t>
       </w:r>
-      <w:r>
-        <w:t xml:space="preserve">$\GtwoDeltatenTfive$</w:t>
-      </w:r>
+      <m:oMath>
+        <m:r>
+          <m:rPr>
+            <m:sty m:val="p"/>
+          </m:rPr>
+          <m:t>+</m:t>
+        </m:r>
+        <m:r>
+          <m:t>11.4</m:t>
+        </m:r>
+      </m:oMath>
       <w:r>
         <w:t xml:space="preserve"> pp (</w:t>
       </w:r>
-      <w:r>
-        <w:t xml:space="preserve">$p=\GtwoPtenTfive$</w:t>
-      </w:r>
+      <m:oMath>
+        <m:r>
+          <m:t>p</m:t>
+        </m:r>
+        <m:r>
+          <m:rPr>
+            <m:sty m:val="p"/>
+          </m:rPr>
+          <m:t>=</m:t>
+        </m:r>
+        <m:r>
+          <m:t>0.013</m:t>
+        </m:r>
+      </m:oMath>
       <w:r>
         <w:t xml:space="preserve">, 95 % CI</w:t>
       </w:r>
       <w:r>
         <w:t xml:space="preserve"> </w:t>
       </w:r>
-      <w:r>
-        <w:t xml:space="preserve">$[\GtwoCItenLoTfive, \GtwoCItenHiTfive]$</w:t>
-      </w:r>
+      <m:oMath>
+        <m:r>
+          <m:rPr>
+            <m:sty m:val="p"/>
+          </m:rPr>
+          <m:t>[</m:t>
+        </m:r>
+        <m:r>
+          <m:t>5.80</m:t>
+        </m:r>
+        <m:r>
+          <m:rPr>
+            <m:sty m:val="p"/>
+          </m:rPr>
+          <m:t>,</m:t>
+        </m:r>
+        <m:r>
+          <m:t>17.00</m:t>
+        </m:r>
+        <m:r>
+          <m:rPr>
+            <m:sty m:val="p"/>
+          </m:rPr>
+          <m:t>]</m:t>
+        </m:r>
+      </m:oMath>
       <w:r>
         <w:t xml:space="preserve">), respectively. The Generation 5–10 slope was</w:t>
       </w:r>
       <w:r>
         <w:t xml:space="preserve"> </w:t>
       </w:r>
-      <w:r>
-        <w:t xml:space="preserve">$\GtwoSlopeFifty$</w:t>
-      </w:r>
+      <m:oMath>
+        <m:r>
+          <m:rPr>
+            <m:sty m:val="p"/>
+          </m:rPr>
+          <m:t>−</m:t>
+        </m:r>
+        <m:r>
+          <m:t>0.91</m:t>
+        </m:r>
+      </m:oMath>
       <w:r>
         <w:t xml:space="preserve"> pp/generation in the 50% arm versus</w:t>
       </w:r>
       <w:r>
         <w:t xml:space="preserve"> </w:t>
       </w:r>
-      <w:r>
-        <w:t xml:space="preserve">$\GtwoSlopeZero$</w:t>
-      </w:r>
+      <m:oMath>
+        <m:r>
+          <m:rPr>
+            <m:sty m:val="p"/>
+          </m:rPr>
+          <m:t>−</m:t>
+        </m:r>
+        <m:r>
+          <m:t>0.91</m:t>
+        </m:r>
+      </m:oMath>
       <w:r>
         <w:t xml:space="preserve"> </w:t>
       </w:r>
       <w:r>
         <w:t xml:space="preserve">at 0%, identical to the precision reported (</w:t>
       </w:r>
-      <w:r>
-        <w:t xml:space="preserve">$\GtwoSlopeFifty$</w:t>
-      </w:r>
+      <m:oMath>
+        <m:r>
+          <m:rPr>
+            <m:sty m:val="p"/>
+          </m:rPr>
+          <m:t>−</m:t>
+        </m:r>
+        <m:r>
+          <m:t>0.91</m:t>
+        </m:r>
+      </m:oMath>
       <w:r>
         <w:t xml:space="preserve"> pp/generation in both arms). The intervention improved endpoint retention without demonstrably slowing later loss. The revised manuscript adds:</w:t>
       </w:r>
@@ -6714,6 +6936,12 @@
       </w:r>
       <w:r>
         <w:t xml:space="preserve">inferring which backbone operated at higher relative pressure.”</w:t>
+      </w:r>
+      <w:r>
+        <w:t xml:space="preserve"> </w:t>
+      </w:r>
+      <w:r>
+        <w:t xml:space="preserve">[verbatim]</w:t>
       </w:r>
     </w:p>
     <w:p>
@@ -8733,7 +8961,7 @@
         <w:t xml:space="preserve"> </w:t>
       </w:r>
       <w:r>
-        <w:t xml:space="preserve">further instances: a single-seed grid described as</w:t>
+        <w:t xml:space="preserve">further instances of overstatement: a single-seed grid described as</w:t>
       </w:r>
       <w:r>
         <w:t xml:space="preserve"> </w:t>
@@ -8813,9 +9041,17 @@
       <w:r>
         <w:t xml:space="preserve"> </w:t>
       </w:r>
-      <w:r>
-        <w:t xml:space="preserve">$\BsevenSlopeFifty$</w:t>
-      </w:r>
+      <m:oMath>
+        <m:r>
+          <m:rPr>
+            <m:sty m:val="p"/>
+          </m:rPr>
+          <m:t>−</m:t>
+        </m:r>
+        <m:r>
+          <m:t>0.15</m:t>
+        </m:r>
+      </m:oMath>
       <w:r>
         <w:t xml:space="preserve"> pp/generation; a single-seed</w:t>
       </w:r>
@@ -10664,7 +10900,7 @@
         <w:t xml:space="preserve"> </w:t>
       </w:r>
       <w:r>
-        <w:t xml:space="preserve">is the fraction of training items whose normalised response changed between generation</w:t>
+        <w:t xml:space="preserve">is the fraction of training items whose normalized response changed between generation</w:t>
       </w:r>
       <w:r>
         <w:t xml:space="preserve"> </w:t>
@@ -20231,7 +20467,13 @@
         <w:t xml:space="preserve"> </w:t>
       </w:r>
       <w:r>
-        <w:t xml:space="preserve">stated; all corrected.</w:t>
+        <w:t xml:space="preserve">stated (a different category from the fifteen overstatement</w:t>
+      </w:r>
+      <w:r>
+        <w:t xml:space="preserve"> </w:t>
+      </w:r>
+      <w:r>
+        <w:t xml:space="preserve">instances above); all corrected.</w:t>
       </w:r>
     </w:p>
     <w:p>
@@ -23830,13 +24072,7 @@
         <w:t xml:space="preserve"> </w:t>
       </w:r>
       <w:r>
-        <w:t xml:space="preserve">“</w:t>
-      </w:r>
-      <w:r>
         <w:t xml:space="preserve">“as a conceptual framework for interpreting recursive fine-tuning stability, rather than as a single fitted equation.”</w:t>
-      </w:r>
-      <w:r>
-        <w:t xml:space="preserve">”</w:t>
       </w:r>
     </w:p>
     <w:p>

</xml_diff>

<commit_message>
chore(submission): Abstract 247w + .zenodo.json + CHANGELOG + DOI placeholders
Abstract:
  Cortado de ~258 para 247 palavras (dentro do limite 250 KBS)
  Cortes: '(these are not the same transition type)' e
          'Single-seed ablations are labeled descriptive throughout.'

.zenodo.json (raiz do repositorio):
  v1.0.4, cc-by-4.0, 4 autores com ORCID
  Sem isSupplementTo (DOI KNOSYS so apos aceitacao)
  isSupplementedBy: GitHub URL valido

CHANGELOG.md (raiz do repositorio):
  v1.0.4: make_all.py, fig9, glyph_audit, check_knosys (14+check_16)
  Regista os 5 valores corrigidos no audit de atingibilidade inteira

DOI Zenodo — Opcao A (Concept + Version):
  Apendice A manuscrito (×2): [CONCEPT-DOI] e [VERSION-DOI-v1.0.4]
  Carta p.15 (×2): idem
  Carta p.2 (×1): [VERSION-DOI-v1.0.4]
  Substituir placeholders apos capturar Concept DOI no portal Zenodo

enviar/ actualizado: todos os 4 artefactos
14/14 PASS"
</commit_message>
<xml_diff>
--- a/v4/docs/overleaf/response-to-reviewers.docx
+++ b/v4/docs/overleaf/response-to-reviewers.docx
@@ -353,7 +353,7 @@
         </w:pict>
       </w:r>
     </w:p>
-    <w:bookmarkStart w:id="9" w:name="conventions-used-in-this-response"/>
+    <w:bookmarkStart w:id="10" w:name="conventions-used-in-this-response"/>
     <w:p>
       <w:pPr>
         <w:pStyle w:val="Heading1"/>
@@ -532,13 +532,21 @@
         <w:t xml:space="preserve"> </w:t>
       </w:r>
       <w:r>
-        <w:t xml:space="preserve">(repository HEAD;</w:t>
-      </w:r>
-      <w:r>
-        <w:t xml:space="preserve"> </w:t>
-      </w:r>
-      <w:r>
-        <w:t xml:space="preserve">to be included in the next Zenodo release) and are</w:t>
+        <w:t xml:space="preserve">(Zenodo v1.0.4,</w:t>
+      </w:r>
+      <w:r>
+        <w:t xml:space="preserve"> </w:t>
+      </w:r>
+      <w:hyperlink r:id="rId9">
+        <w:r>
+          <w:rPr>
+            <w:rStyle w:val="Hyperlink"/>
+          </w:rPr>
+          <w:t xml:space="preserve">https://doi.org/10.5281/zenodo.[VERSION-DOI-v1.0.4]</w:t>
+        </w:r>
+      </w:hyperlink>
+      <w:r>
+        <w:t xml:space="preserve">) and are</w:t>
       </w:r>
       <w:r>
         <w:t xml:space="preserve"> </w:t>
@@ -547,8 +555,8 @@
         <w:t xml:space="preserve">reproduced verbatim from its output.</w:t>
       </w:r>
     </w:p>
-    <w:bookmarkEnd w:id="9"/>
-    <w:bookmarkStart w:id="10" w:name="X8a2e089d167bb9c51b4760d1d7ab020fce3a997"/>
+    <w:bookmarkEnd w:id="10"/>
+    <w:bookmarkStart w:id="11" w:name="X8a2e089d167bb9c51b4760d1d7ab020fce3a997"/>
     <w:p>
       <w:pPr>
         <w:pStyle w:val="Heading1"/>
@@ -1004,8 +1012,8 @@
         </w:pict>
       </w:r>
     </w:p>
-    <w:bookmarkEnd w:id="10"/>
-    <w:bookmarkStart w:id="11" w:name="summary-of-changes"/>
+    <w:bookmarkEnd w:id="11"/>
+    <w:bookmarkStart w:id="12" w:name="summary-of-changes"/>
     <w:p>
       <w:pPr>
         <w:pStyle w:val="Heading1"/>
@@ -1070,8 +1078,8 @@
         <w:t xml:space="preserve">The table maps every point to the revision made and its location.</w:t>
       </w:r>
     </w:p>
-    <w:bookmarkEnd w:id="11"/>
-    <w:bookmarkStart w:id="12" w:name="editor"/>
+    <w:bookmarkEnd w:id="12"/>
+    <w:bookmarkStart w:id="13" w:name="editor"/>
     <w:p>
       <w:pPr>
         <w:pStyle w:val="Heading1"/>
@@ -1709,8 +1717,8 @@
         <w:t xml:space="preserve">revision, with the corresponding section and page cited.</w:t>
       </w:r>
     </w:p>
-    <w:bookmarkEnd w:id="12"/>
-    <w:bookmarkStart w:id="17" w:name="reviewer-1"/>
+    <w:bookmarkEnd w:id="13"/>
+    <w:bookmarkStart w:id="18" w:name="reviewer-1"/>
     <w:p>
       <w:pPr>
         <w:pStyle w:val="Heading1"/>
@@ -6979,18 +6987,18 @@
           <wp:inline>
             <wp:extent cx="4533900" cy="2804870"/>
             <wp:effectExtent b="0" l="0" r="0" t="0"/>
-            <wp:docPr descr="image" title="" id="14" name="Picture"/>
+            <wp:docPr descr="image" title="" id="15" name="Picture"/>
             <a:graphic>
               <a:graphicData uri="http://schemas.openxmlformats.org/drawingml/2006/picture">
                 <pic:pic>
                   <pic:nvPicPr>
-                    <pic:cNvPr descr="fig9_dose_response.png" id="15" name="Picture"/>
+                    <pic:cNvPr descr="fig9_dose_response.png" id="16" name="Picture"/>
                     <pic:cNvPicPr>
                       <a:picLocks noChangeArrowheads="1" noChangeAspect="1"/>
                     </pic:cNvPicPr>
                   </pic:nvPicPr>
                   <pic:blipFill>
-                    <a:blip r:embed="rId13"/>
+                    <a:blip r:embed="rId14"/>
                     <a:stretch>
                       <a:fillRect/>
                     </a:stretch>
@@ -7341,20 +7349,40 @@
         <w:t xml:space="preserve"> </w:t>
       </w:r>
       <w:r>
-        <w:t xml:space="preserve">Release v1.0.3 of the Zenodo archive (DOI:</w:t>
-      </w:r>
-      <w:r>
-        <w:t xml:space="preserve"> </w:t>
-      </w:r>
-      <w:hyperlink r:id="rId16">
+        <w:t xml:space="preserve">Release v1.0.4 of the Zenodo archive (Concept DOI:</w:t>
+      </w:r>
+      <w:r>
+        <w:t xml:space="preserve"> </w:t>
+      </w:r>
+      <w:hyperlink r:id="rId17">
         <w:r>
           <w:rPr>
             <w:rStyle w:val="Hyperlink"/>
           </w:rPr>
-          <w:t xml:space="preserve">10.5281/zenodo.23146342</w:t>
+          <w:t xml:space="preserve">https://doi.org/10.5281/zenodo.[CONCEPT-DOI]</w:t>
         </w:r>
       </w:hyperlink>
       <w:r>
+        <w:t xml:space="preserve">;</w:t>
+      </w:r>
+      <w:r>
+        <w:t xml:space="preserve"> </w:t>
+      </w:r>
+      <w:r>
+        <w:t xml:space="preserve">Version DOI:</w:t>
+      </w:r>
+      <w:r>
+        <w:t xml:space="preserve"> </w:t>
+      </w:r>
+      <w:hyperlink r:id="rId9">
+        <w:r>
+          <w:rPr>
+            <w:rStyle w:val="Hyperlink"/>
+          </w:rPr>
+          <w:t xml:space="preserve">https://doi.org/10.5281/zenodo.[VERSION-DOI-v1.0.4]</w:t>
+        </w:r>
+      </w:hyperlink>
+      <w:r>
         <w:t xml:space="preserve">)</w:t>
       </w:r>
       <w:r>
@@ -7373,7 +7401,7 @@
         <w:t xml:space="preserve"> </w:t>
       </w:r>
       <w:r>
-        <w:t xml:space="preserve">(ii) the training configuration files for every reported condition; and</w:t>
+        <w:t xml:space="preserve">(ii) the training configuration files for every reported condition;</w:t>
       </w:r>
       <w:r>
         <w:t xml:space="preserve"> </w:t>
@@ -7402,13 +7430,13 @@
         <w:t xml:space="preserve"> </w:t>
       </w:r>
       <w:r>
-        <w:t xml:space="preserve">baseline sets for all three backbones. The analysis and</w:t>
-      </w:r>
-      <w:r>
-        <w:t xml:space="preserve"> </w:t>
-      </w:r>
-      <w:r>
-        <w:t xml:space="preserve">table-generation script</w:t>
+        <w:t xml:space="preserve">baseline sets for all three backbones; and</w:t>
+      </w:r>
+      <w:r>
+        <w:t xml:space="preserve"> </w:t>
+      </w:r>
+      <w:r>
+        <w:t xml:space="preserve">(iv) the analysis and table-generation script</w:t>
       </w:r>
       <w:r>
         <w:t xml:space="preserve"> </w:t>
@@ -7420,13 +7448,13 @@
         <w:t xml:space="preserve">make_all.py</w:t>
       </w:r>
       <w:r>
-        <w:t xml:space="preserve">, the figure-generation</w:t>
-      </w:r>
-      <w:r>
-        <w:t xml:space="preserve"> </w:t>
-      </w:r>
-      <w:r>
-        <w:t xml:space="preserve">scripts (including</w:t>
+        <w:t xml:space="preserve">,</w:t>
+      </w:r>
+      <w:r>
+        <w:t xml:space="preserve"> </w:t>
+      </w:r>
+      <w:r>
+        <w:t xml:space="preserve">the figure-generation scripts (including</w:t>
       </w:r>
       <w:r>
         <w:t xml:space="preserve"> </w:t>
@@ -7438,19 +7466,13 @@
         <w:t xml:space="preserve">fig9_dose_response.py</w:t>
       </w:r>
       <w:r>
-        <w:t xml:space="preserve">) and the glyph audit</w:t>
-      </w:r>
-      <w:r>
-        <w:t xml:space="preserve"> </w:t>
-      </w:r>
-      <w:r>
-        <w:t xml:space="preserve">script are on the HEAD of the GitHub repository and will be deposited in</w:t>
-      </w:r>
-      <w:r>
-        <w:t xml:space="preserve"> </w:t>
-      </w:r>
-      <w:r>
-        <w:t xml:space="preserve">the next Zenodo release, as stated in Appendix A.</w:t>
+        <w:t xml:space="preserve">),</w:t>
+      </w:r>
+      <w:r>
+        <w:t xml:space="preserve"> </w:t>
+      </w:r>
+      <w:r>
+        <w:t xml:space="preserve">and the glyph audit script.</w:t>
       </w:r>
     </w:p>
     <w:p>
@@ -7714,8 +7736,8 @@
         <w:t xml:space="preserve">Revised manuscript: Appendix A (reproducibility and data availability).</w:t>
       </w:r>
     </w:p>
-    <w:bookmarkEnd w:id="17"/>
-    <w:bookmarkStart w:id="24" w:name="reviewer-2"/>
+    <w:bookmarkEnd w:id="18"/>
+    <w:bookmarkStart w:id="25" w:name="reviewer-2"/>
     <w:p>
       <w:pPr>
         <w:pStyle w:val="Heading1"/>
@@ -9761,18 +9783,18 @@
           <wp:inline>
             <wp:extent cx="5334000" cy="2844800"/>
             <wp:effectExtent b="0" l="0" r="0" t="0"/>
-            <wp:docPr descr="image" title="" id="19" name="Picture"/>
+            <wp:docPr descr="image" title="" id="20" name="Picture"/>
             <a:graphic>
               <a:graphicData uri="http://schemas.openxmlformats.org/drawingml/2006/picture">
                 <pic:pic>
                   <pic:nvPicPr>
-                    <pic:cNvPr descr="fig1_overview.pdf" id="20" name="Picture"/>
+                    <pic:cNvPr descr="fig1_overview.pdf" id="21" name="Picture"/>
                     <pic:cNvPicPr>
                       <a:picLocks noChangeArrowheads="1" noChangeAspect="1"/>
                     </pic:cNvPicPr>
                   </pic:nvPicPr>
                   <pic:blipFill>
-                    <a:blip r:embed="rId18"/>
+                    <a:blip r:embed="rId19"/>
                     <a:stretch>
                       <a:fillRect/>
                     </a:stretch>
@@ -19902,18 +19924,18 @@
           <wp:inline>
             <wp:extent cx="3036786" cy="4312053"/>
             <wp:effectExtent b="0" l="0" r="0" t="0"/>
-            <wp:docPr descr="image" title="" id="22" name="Picture"/>
+            <wp:docPr descr="image" title="" id="23" name="Picture"/>
             <a:graphic>
               <a:graphicData uri="http://schemas.openxmlformats.org/drawingml/2006/picture">
                 <pic:pic>
                   <pic:nvPicPr>
-                    <pic:cNvPr descr="fig_interventions.png" id="23" name="Picture"/>
+                    <pic:cNvPr descr="fig_interventions.png" id="24" name="Picture"/>
                     <pic:cNvPicPr>
                       <a:picLocks noChangeArrowheads="1" noChangeAspect="1"/>
                     </pic:cNvPicPr>
                   </pic:nvPicPr>
                   <pic:blipFill>
-                    <a:blip r:embed="rId21"/>
+                    <a:blip r:embed="rId22"/>
                     <a:stretch>
                       <a:fillRect/>
                     </a:stretch>
@@ -24716,7 +24738,7 @@
         <w:t xml:space="preserve">[32], [33], [41]; §5.2; §2.3–2.4; §3.3; Table S1.</w:t>
       </w:r>
     </w:p>
-    <w:bookmarkEnd w:id="24"/>
+    <w:bookmarkEnd w:id="25"/>
     <w:sectPr>
       <w:footnotePr>
         <w:numRestart w:val="eachSect"/>

</xml_diff>

<commit_message>
fix(zenodo): substituir placeholders pelo DOI real v1.0.4
Zenodo v1.0.4 publicado: https://zenodo.org/records/23185146
  Concept DOI = Version DOI v1.0.4 = 10.5281/zenodo.23185146
  (v1.0.4 criou registo novo no Zenodo — Concept e Version coincidem)

Substituicoes nos 5 locais:
  Manuscrito Appendice A (x2): [CONCEPT-DOI] e [VERSION-DOI-v1.0.4]
  Carta p.15 (x2): idem
  Carta p.2 (x1): [VERSION-DOI-v1.0.4]
  -> todos -> 10.5281/zenodo.23185146

14/14 PASS
enviar/ actualizado: pacote final de submissao"
</commit_message>
<xml_diff>
--- a/v4/docs/overleaf/response-to-reviewers.docx
+++ b/v4/docs/overleaf/response-to-reviewers.docx
@@ -542,7 +542,7 @@
           <w:rPr>
             <w:rStyle w:val="Hyperlink"/>
           </w:rPr>
-          <w:t xml:space="preserve">https://doi.org/10.5281/zenodo.[VERSION-DOI-v1.0.4]</w:t>
+          <w:t xml:space="preserve">https://doi.org/10.5281/zenodo.23185146</w:t>
         </w:r>
       </w:hyperlink>
       <w:r>
@@ -1718,7 +1718,7 @@
       </w:r>
     </w:p>
     <w:bookmarkEnd w:id="13"/>
-    <w:bookmarkStart w:id="18" w:name="reviewer-1"/>
+    <w:bookmarkStart w:id="17" w:name="reviewer-1"/>
     <w:p>
       <w:pPr>
         <w:pStyle w:val="Heading1"/>
@@ -7354,32 +7354,32 @@
       <w:r>
         <w:t xml:space="preserve"> </w:t>
       </w:r>
-      <w:hyperlink r:id="rId17">
-        <w:r>
-          <w:rPr>
-            <w:rStyle w:val="Hyperlink"/>
-          </w:rPr>
-          <w:t xml:space="preserve">https://doi.org/10.5281/zenodo.[CONCEPT-DOI]</w:t>
-        </w:r>
-      </w:hyperlink>
-      <w:r>
-        <w:t xml:space="preserve">;</w:t>
-      </w:r>
-      <w:r>
-        <w:t xml:space="preserve"> </w:t>
-      </w:r>
-      <w:r>
-        <w:t xml:space="preserve">Version DOI:</w:t>
-      </w:r>
-      <w:r>
-        <w:t xml:space="preserve"> </w:t>
-      </w:r>
       <w:hyperlink r:id="rId9">
         <w:r>
           <w:rPr>
             <w:rStyle w:val="Hyperlink"/>
           </w:rPr>
-          <w:t xml:space="preserve">https://doi.org/10.5281/zenodo.[VERSION-DOI-v1.0.4]</w:t>
+          <w:t xml:space="preserve">https://doi.org/10.5281/zenodo.23185146</w:t>
+        </w:r>
+      </w:hyperlink>
+      <w:r>
+        <w:t xml:space="preserve">;</w:t>
+      </w:r>
+      <w:r>
+        <w:t xml:space="preserve"> </w:t>
+      </w:r>
+      <w:r>
+        <w:t xml:space="preserve">Version DOI:</w:t>
+      </w:r>
+      <w:r>
+        <w:t xml:space="preserve"> </w:t>
+      </w:r>
+      <w:hyperlink r:id="rId9">
+        <w:r>
+          <w:rPr>
+            <w:rStyle w:val="Hyperlink"/>
+          </w:rPr>
+          <w:t xml:space="preserve">https://doi.org/10.5281/zenodo.23185146</w:t>
         </w:r>
       </w:hyperlink>
       <w:r>
@@ -7736,8 +7736,8 @@
         <w:t xml:space="preserve">Revised manuscript: Appendix A (reproducibility and data availability).</w:t>
       </w:r>
     </w:p>
-    <w:bookmarkEnd w:id="18"/>
-    <w:bookmarkStart w:id="25" w:name="reviewer-2"/>
+    <w:bookmarkEnd w:id="17"/>
+    <w:bookmarkStart w:id="24" w:name="reviewer-2"/>
     <w:p>
       <w:pPr>
         <w:pStyle w:val="Heading1"/>
@@ -9783,18 +9783,18 @@
           <wp:inline>
             <wp:extent cx="5334000" cy="2844800"/>
             <wp:effectExtent b="0" l="0" r="0" t="0"/>
-            <wp:docPr descr="image" title="" id="20" name="Picture"/>
+            <wp:docPr descr="image" title="" id="19" name="Picture"/>
             <a:graphic>
               <a:graphicData uri="http://schemas.openxmlformats.org/drawingml/2006/picture">
                 <pic:pic>
                   <pic:nvPicPr>
-                    <pic:cNvPr descr="fig1_overview.pdf" id="21" name="Picture"/>
+                    <pic:cNvPr descr="fig1_overview.pdf" id="20" name="Picture"/>
                     <pic:cNvPicPr>
                       <a:picLocks noChangeArrowheads="1" noChangeAspect="1"/>
                     </pic:cNvPicPr>
                   </pic:nvPicPr>
                   <pic:blipFill>
-                    <a:blip r:embed="rId19"/>
+                    <a:blip r:embed="rId18"/>
                     <a:stretch>
                       <a:fillRect/>
                     </a:stretch>
@@ -19924,18 +19924,18 @@
           <wp:inline>
             <wp:extent cx="3036786" cy="4312053"/>
             <wp:effectExtent b="0" l="0" r="0" t="0"/>
-            <wp:docPr descr="image" title="" id="23" name="Picture"/>
+            <wp:docPr descr="image" title="" id="22" name="Picture"/>
             <a:graphic>
               <a:graphicData uri="http://schemas.openxmlformats.org/drawingml/2006/picture">
                 <pic:pic>
                   <pic:nvPicPr>
-                    <pic:cNvPr descr="fig_interventions.png" id="24" name="Picture"/>
+                    <pic:cNvPr descr="fig_interventions.png" id="23" name="Picture"/>
                     <pic:cNvPicPr>
                       <a:picLocks noChangeArrowheads="1" noChangeAspect="1"/>
                     </pic:cNvPicPr>
                   </pic:nvPicPr>
                   <pic:blipFill>
-                    <a:blip r:embed="rId22"/>
+                    <a:blip r:embed="rId21"/>
                     <a:stretch>
                       <a:fillRect/>
                     </a:stretch>
@@ -24738,7 +24738,7 @@
         <w:t xml:space="preserve">[32], [33], [41]; §5.2; §2.3–2.4; §3.3; Table S1.</w:t>
       </w:r>
     </w:p>
-    <w:bookmarkEnd w:id="25"/>
+    <w:bookmarkEnd w:id="24"/>
     <w:sectPr>
       <w:footnotePr>
         <w:numRestart w:val="eachSect"/>

</xml_diff>

<commit_message>
fix(zenodo): Concept DOI correcto 23145361 (era 23185146)
O 1404826525 era o badge/repository ID do Zenodo, nao um DOI.
O Concept DOI real esta no Target URL do badge:
  Concept DOI = 10.5281/zenodo.23145361 (resolve sempre para a mais recente)
  Version DOI v1.0.4 = 10.5281/zenodo.23185146

Alteracoes:
  MAN L2516: Concept DOI 23185146 -> 23145361
  CARTA L775: Concept DOI 23185146 -> 23145361
  MAN L2518 + CARTA L776 + CARTA L144: Version DOI 23185146 mantido

14/14 PASS
enviar/ actualizado: pacote final"
</commit_message>
<xml_diff>
--- a/v4/docs/overleaf/response-to-reviewers.docx
+++ b/v4/docs/overleaf/response-to-reviewers.docx
@@ -1718,7 +1718,7 @@
       </w:r>
     </w:p>
     <w:bookmarkEnd w:id="13"/>
-    <w:bookmarkStart w:id="17" w:name="reviewer-1"/>
+    <w:bookmarkStart w:id="18" w:name="reviewer-1"/>
     <w:p>
       <w:pPr>
         <w:pStyle w:val="Heading1"/>
@@ -7354,12 +7354,12 @@
       <w:r>
         <w:t xml:space="preserve"> </w:t>
       </w:r>
-      <w:hyperlink r:id="rId9">
+      <w:hyperlink r:id="rId17">
         <w:r>
           <w:rPr>
             <w:rStyle w:val="Hyperlink"/>
           </w:rPr>
-          <w:t xml:space="preserve">https://doi.org/10.5281/zenodo.23185146</w:t>
+          <w:t xml:space="preserve">https://doi.org/10.5281/zenodo.23145361</w:t>
         </w:r>
       </w:hyperlink>
       <w:r>
@@ -7736,8 +7736,8 @@
         <w:t xml:space="preserve">Revised manuscript: Appendix A (reproducibility and data availability).</w:t>
       </w:r>
     </w:p>
-    <w:bookmarkEnd w:id="17"/>
-    <w:bookmarkStart w:id="24" w:name="reviewer-2"/>
+    <w:bookmarkEnd w:id="18"/>
+    <w:bookmarkStart w:id="25" w:name="reviewer-2"/>
     <w:p>
       <w:pPr>
         <w:pStyle w:val="Heading1"/>
@@ -9783,18 +9783,18 @@
           <wp:inline>
             <wp:extent cx="5334000" cy="2844800"/>
             <wp:effectExtent b="0" l="0" r="0" t="0"/>
-            <wp:docPr descr="image" title="" id="19" name="Picture"/>
+            <wp:docPr descr="image" title="" id="20" name="Picture"/>
             <a:graphic>
               <a:graphicData uri="http://schemas.openxmlformats.org/drawingml/2006/picture">
                 <pic:pic>
                   <pic:nvPicPr>
-                    <pic:cNvPr descr="fig1_overview.pdf" id="20" name="Picture"/>
+                    <pic:cNvPr descr="fig1_overview.pdf" id="21" name="Picture"/>
                     <pic:cNvPicPr>
                       <a:picLocks noChangeArrowheads="1" noChangeAspect="1"/>
                     </pic:cNvPicPr>
                   </pic:nvPicPr>
                   <pic:blipFill>
-                    <a:blip r:embed="rId18"/>
+                    <a:blip r:embed="rId19"/>
                     <a:stretch>
                       <a:fillRect/>
                     </a:stretch>
@@ -19924,18 +19924,18 @@
           <wp:inline>
             <wp:extent cx="3036786" cy="4312053"/>
             <wp:effectExtent b="0" l="0" r="0" t="0"/>
-            <wp:docPr descr="image" title="" id="22" name="Picture"/>
+            <wp:docPr descr="image" title="" id="23" name="Picture"/>
             <a:graphic>
               <a:graphicData uri="http://schemas.openxmlformats.org/drawingml/2006/picture">
                 <pic:pic>
                   <pic:nvPicPr>
-                    <pic:cNvPr descr="fig_interventions.png" id="23" name="Picture"/>
+                    <pic:cNvPr descr="fig_interventions.png" id="24" name="Picture"/>
                     <pic:cNvPicPr>
                       <a:picLocks noChangeArrowheads="1" noChangeAspect="1"/>
                     </pic:cNvPicPr>
                   </pic:nvPicPr>
                   <pic:blipFill>
-                    <a:blip r:embed="rId21"/>
+                    <a:blip r:embed="rId22"/>
                     <a:stretch>
                       <a:fillRect/>
                     </a:stretch>
@@ -24738,7 +24738,7 @@
         <w:t xml:space="preserve">[32], [33], [41]; §5.2; §2.3–2.4; §3.3; Table S1.</w:t>
       </w:r>
     </w:p>
-    <w:bookmarkEnd w:id="24"/>
+    <w:bookmarkEnd w:id="25"/>
     <w:sectPr>
       <w:footnotePr>
         <w:numRestart w:val="eachSect"/>

</xml_diff>